<commit_message>
Unite sonu sorularindaki gorsel kutularina Shutterstock ID'leri eklendi
</commit_message>
<xml_diff>
--- a/sorular/Kim11_tema-1-unite-sonu-sorulari.docx
+++ b/sorular/Kim11_tema-1-unite-sonu-sorulari.docx
@@ -3648,7 +3648,7 @@
                 <w:rFonts w:ascii="Times New Roman" w:hAnsi="Times New Roman" w:cs="Times New Roman"/>
                 <w:lang w:val="tr-TR"/>
               </w:rPr>
-              <w:t xml:space="preserve">GÖRSEL ALANI</w:t>
+              <w:t xml:space="preserve">GÖRSEL ALANI (Shutterstock)</w:t>
             </w:r>
           </w:p>
           <w:p>
@@ -3680,23 +3680,7 @@
                 <w:rFonts w:ascii="Times New Roman" w:hAnsi="Times New Roman" w:cs="Times New Roman"/>
                 <w:lang w:val="tr-TR"/>
               </w:rPr>
-              <w:t xml:space="preserve">Shutterstock arama: “cappadocia hot air balloon burner flame”</w:t>
-            </w:r>
-          </w:p>
-          <w:p>
-            <w:pPr>
-              <w:jc w:val="both"/>
-              <w:rPr>
-                <w:rFonts w:ascii="Times New Roman" w:hAnsi="Times New Roman" w:cs="Times New Roman"/>
-                <w:lang w:val="tr-TR"/>
-              </w:rPr>
-            </w:pPr>
-            <w:r>
-              <w:rPr>
-                <w:rFonts w:ascii="Times New Roman" w:hAnsi="Times New Roman" w:cs="Times New Roman"/>
-                <w:lang w:val="tr-TR"/>
-              </w:rPr>
-              <w:t xml:space="preserve">Shutter ID: ……………</w:t>
+              <w:t xml:space="preserve">Shutter ID: 2754539319 (fotoğraf) — Flame inflating hot air balloon before sunrise flight in Cappadocia</w:t>
             </w:r>
           </w:p>
         </w:tc>
@@ -9535,7 +9519,7 @@
                 <w:rFonts w:ascii="Times New Roman" w:hAnsi="Times New Roman" w:cs="Times New Roman"/>
                 <w:lang w:val="tr-TR"/>
               </w:rPr>
-              <w:t xml:space="preserve">GÖRSEL ALANI</w:t>
+              <w:t xml:space="preserve">GÖRSEL ALANI (Shutterstock)</w:t>
             </w:r>
           </w:p>
           <w:p>
@@ -9567,23 +9551,7 @@
                 <w:rFonts w:ascii="Times New Roman" w:hAnsi="Times New Roman" w:cs="Times New Roman"/>
                 <w:lang w:val="tr-TR"/>
               </w:rPr>
-              <w:t xml:space="preserve">Shutterstock arama: “tea factory rize tea plantation”</w:t>
-            </w:r>
-          </w:p>
-          <w:p>
-            <w:pPr>
-              <w:jc w:val="both"/>
-              <w:rPr>
-                <w:rFonts w:ascii="Times New Roman" w:hAnsi="Times New Roman" w:cs="Times New Roman"/>
-                <w:lang w:val="tr-TR"/>
-              </w:rPr>
-            </w:pPr>
-            <w:r>
-              <w:rPr>
-                <w:rFonts w:ascii="Times New Roman" w:hAnsi="Times New Roman" w:cs="Times New Roman"/>
-                <w:lang w:val="tr-TR"/>
-              </w:rPr>
-              <w:t xml:space="preserve">Shutter ID: ……………</w:t>
+              <w:t xml:space="preserve">Shutter ID: 2634441035 (fotoğraf) — Tea plantation in Haremtepe Ceceva village, Rize, Turkey</w:t>
             </w:r>
           </w:p>
         </w:tc>

</xml_diff>